<commit_message>
Reviewer comments on every part; edits on the review pages are written into the Word syllabus with Approve all changes
Co-Authored-By: Claude Opus 5.5 <noreply@anthropic.com>
Claude-Session: https://claude.ai/code/session_01QC4xbs3DBBWiTW38zffG9q
</commit_message>
<xml_diff>
--- a/files/ENT241-Syllabus-Suggested.docx
+++ b/files/ENT241-Syllabus-Suggested.docx
@@ -2924,7 +2924,7 @@
                 <w:sz w:val="20"/>
                 <w:szCs w:val="20"/>
               </w:rPr>
-              <w:t xml:space="preserve">Burns (2022) Ch. 1 &amp; 3; Okasha (2020)</w:t>
+              <w:t>Burns (2022) Ch. 1&amp;3, Okasha (2020) *</w:t>
             </w:r>
           </w:p>
         </w:tc>
@@ -4574,7 +4574,7 @@
                 <w:sz w:val="20"/>
                 <w:szCs w:val="20"/>
               </w:rPr>
-              <w:t xml:space="preserve">1, 3</w:t>
+              <w:t>1,3</w:t>
             </w:r>
           </w:p>
         </w:tc>
@@ -4931,7 +4931,7 @@
                 <w:sz w:val="20"/>
                 <w:szCs w:val="20"/>
               </w:rPr>
-              <w:t xml:space="preserve">1, 3</w:t>
+              <w:t>1,3</w:t>
             </w:r>
           </w:p>
         </w:tc>

</xml_diff>